<commit_message>
refactor: update plotting styles and prediction date for report generation
</commit_message>
<xml_diff>
--- a/diplomova_praca.docx
+++ b/diplomova_praca.docx
@@ -12947,13 +12947,13 @@
         <mc:AlternateContent>
           <mc:Choice Requires="wps">
             <w:drawing>
-              <wp:anchor distT="0" distB="0" distL="114300" distR="114300" simplePos="0" relativeHeight="251666432" behindDoc="0" locked="0" layoutInCell="1" allowOverlap="1" wp14:anchorId="6E97E656" wp14:editId="21490ED6">
+              <wp:anchor distT="0" distB="0" distL="114300" distR="114300" simplePos="0" relativeHeight="251663360" behindDoc="0" locked="0" layoutInCell="1" allowOverlap="1" wp14:anchorId="6E97E656" wp14:editId="724495A0">
                 <wp:simplePos x="0" y="0"/>
                 <wp:positionH relativeFrom="column">
                   <wp:posOffset>-7620</wp:posOffset>
                 </wp:positionH>
                 <wp:positionV relativeFrom="paragraph">
-                  <wp:posOffset>8472805</wp:posOffset>
+                  <wp:posOffset>8417560</wp:posOffset>
                 </wp:positionV>
                 <wp:extent cx="5851525" cy="635"/>
                 <wp:effectExtent l="0" t="0" r="3175" b="12065"/>
@@ -13027,7 +13027,7 @@
                 <v:stroke joinstyle="miter"/>
                 <v:path gradientshapeok="t" o:connecttype="rect"/>
               </v:shapetype>
-              <v:shape id="Text Box 1" o:spid="_x0000_s1026" type="#_x0000_t202" style="position:absolute;left:0;text-align:left;margin-left:-.6pt;margin-top:667.15pt;width:460.75pt;height:.05pt;z-index:251666432;visibility:visible;mso-wrap-style:square;mso-wrap-distance-left:9pt;mso-wrap-distance-top:0;mso-wrap-distance-right:9pt;mso-wrap-distance-bottom:0;mso-position-horizontal:absolute;mso-position-horizontal-relative:text;mso-position-vertical:absolute;mso-position-vertical-relative:text;v-text-anchor:top" o:gfxdata="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" stroked="f">
+              <v:shape id="Text Box 1" o:spid="_x0000_s1026" type="#_x0000_t202" style="position:absolute;left:0;text-align:left;margin-left:-.6pt;margin-top:662.8pt;width:460.75pt;height:.05pt;z-index:251663360;visibility:visible;mso-wrap-style:square;mso-wrap-distance-left:9pt;mso-wrap-distance-top:0;mso-wrap-distance-right:9pt;mso-wrap-distance-bottom:0;mso-position-horizontal:absolute;mso-position-horizontal-relative:text;mso-position-vertical:absolute;mso-position-vertical-relative:text;v-text-anchor:top" o:gfxdata="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" stroked="f">
                 <v:textbox style="mso-fit-shape-to-text:t" inset="0,0,0,0">
                   <w:txbxContent>
                     <w:p>
@@ -13068,89 +13068,25 @@
         <w:rPr>
           <w:noProof/>
         </w:rPr>
-        <w:drawing>
-          <wp:anchor distT="0" distB="0" distL="114300" distR="114300" simplePos="0" relativeHeight="251664384" behindDoc="0" locked="0" layoutInCell="1" allowOverlap="1" wp14:anchorId="0E50653B" wp14:editId="50C064F5">
-            <wp:simplePos x="0" y="0"/>
-            <wp:positionH relativeFrom="column">
-              <wp:posOffset>-7793</wp:posOffset>
-            </wp:positionH>
-            <wp:positionV relativeFrom="paragraph">
-              <wp:posOffset>5230611</wp:posOffset>
-            </wp:positionV>
-            <wp:extent cx="5851525" cy="3185160"/>
-            <wp:effectExtent l="0" t="0" r="3175" b="2540"/>
-            <wp:wrapTopAndBottom/>
-            <wp:docPr id="1843029070" name="Picture 4"/>
-            <wp:cNvGraphicFramePr>
-              <a:graphicFrameLocks xmlns:a="http://schemas.openxmlformats.org/drawingml/2006/main" noChangeAspect="1"/>
-            </wp:cNvGraphicFramePr>
-            <a:graphic xmlns:a="http://schemas.openxmlformats.org/drawingml/2006/main">
-              <a:graphicData uri="http://schemas.openxmlformats.org/drawingml/2006/picture">
-                <pic:pic xmlns:pic="http://schemas.openxmlformats.org/drawingml/2006/picture">
-                  <pic:nvPicPr>
-                    <pic:cNvPr id="1843029070" name="Picture 1843029070"/>
-                    <pic:cNvPicPr/>
-                  </pic:nvPicPr>
-                  <pic:blipFill>
-                    <a:blip r:embed="rId10" cstate="print">
-                      <a:extLst>
-                        <a:ext uri="{28A0092B-C50C-407E-A947-70E740481C1C}">
-                          <a14:useLocalDpi xmlns:a14="http://schemas.microsoft.com/office/drawing/2010/main" val="0"/>
-                        </a:ext>
-                      </a:extLst>
-                    </a:blip>
-                    <a:stretch>
-                      <a:fillRect/>
-                    </a:stretch>
-                  </pic:blipFill>
-                  <pic:spPr>
-                    <a:xfrm>
-                      <a:off x="0" y="0"/>
-                      <a:ext cx="5851525" cy="3185160"/>
-                    </a:xfrm>
-                    <a:prstGeom prst="rect">
-                      <a:avLst/>
-                    </a:prstGeom>
-                  </pic:spPr>
-                </pic:pic>
-              </a:graphicData>
-            </a:graphic>
-            <wp14:sizeRelH relativeFrom="page">
-              <wp14:pctWidth>0</wp14:pctWidth>
-            </wp14:sizeRelH>
-            <wp14:sizeRelV relativeFrom="page">
-              <wp14:pctHeight>0</wp14:pctHeight>
-            </wp14:sizeRelV>
-          </wp:anchor>
-        </w:drawing>
-      </w:r>
-      <w:r>
-        <w:rPr>
-          <w:noProof/>
-        </w:rPr>
         <mc:AlternateContent>
           <mc:Choice Requires="wpg">
             <w:drawing>
-              <wp:anchor distT="0" distB="0" distL="114300" distR="114300" simplePos="0" relativeHeight="251663360" behindDoc="0" locked="0" layoutInCell="1" allowOverlap="1" wp14:anchorId="5B726100" wp14:editId="125E1D95">
+              <wp:anchor distT="0" distB="0" distL="114300" distR="114300" simplePos="0" relativeHeight="251660288" behindDoc="0" locked="0" layoutInCell="1" allowOverlap="1" wp14:anchorId="5B726100" wp14:editId="3A5991B2">
                 <wp:simplePos x="0" y="0"/>
                 <wp:positionH relativeFrom="column">
-                  <wp:posOffset>-635</wp:posOffset>
+                  <wp:posOffset>635</wp:posOffset>
                 </wp:positionH>
                 <wp:positionV relativeFrom="paragraph">
-                  <wp:posOffset>246</wp:posOffset>
+                  <wp:posOffset>635</wp:posOffset>
                 </wp:positionV>
-                <wp:extent cx="5932170" cy="3556635"/>
-                <wp:effectExtent l="0" t="0" r="0" b="0"/>
+                <wp:extent cx="5850890" cy="3566160"/>
+                <wp:effectExtent l="0" t="0" r="3810" b="2540"/>
                 <wp:wrapThrough wrapText="bothSides">
                   <wp:wrapPolygon edited="0">
                     <wp:start x="0" y="0"/>
-                    <wp:lineTo x="0" y="20131"/>
-                    <wp:lineTo x="185" y="20979"/>
-                    <wp:lineTo x="185" y="21519"/>
-                    <wp:lineTo x="21549" y="21519"/>
-                    <wp:lineTo x="21549" y="20054"/>
-                    <wp:lineTo x="21364" y="19745"/>
-                    <wp:lineTo x="21364" y="0"/>
+                    <wp:lineTo x="0" y="21538"/>
+                    <wp:lineTo x="21567" y="21538"/>
+                    <wp:lineTo x="21567" y="0"/>
                     <wp:lineTo x="0" y="0"/>
                   </wp:wrapPolygon>
                 </wp:wrapThrough>
@@ -13163,9 +13099,9 @@
                       <wpg:grpSpPr>
                         <a:xfrm>
                           <a:off x="0" y="0"/>
-                          <a:ext cx="5932170" cy="3556635"/>
+                          <a:ext cx="5850890" cy="3566160"/>
                           <a:chOff x="0" y="0"/>
-                          <a:chExt cx="5932528" cy="3556817"/>
+                          <a:chExt cx="5851525" cy="3566688"/>
                         </a:xfrm>
                       </wpg:grpSpPr>
                       <pic:pic xmlns:pic="http://schemas.openxmlformats.org/drawingml/2006/picture">
@@ -13176,7 +13112,7 @@
                           </pic:cNvPicPr>
                         </pic:nvPicPr>
                         <pic:blipFill>
-                          <a:blip r:embed="rId11" cstate="print">
+                          <a:blip r:embed="rId10" cstate="print">
                             <a:extLst>
                               <a:ext uri="{28A0092B-C50C-407E-A947-70E740481C1C}">
                                 <a14:useLocalDpi xmlns:a14="http://schemas.microsoft.com/office/drawing/2010/main" val="0"/>
@@ -13202,7 +13138,7 @@
                         <wps:cNvSpPr txBox="1"/>
                         <wps:spPr>
                           <a:xfrm>
-                            <a:off x="81638" y="3298372"/>
+                            <a:off x="635" y="3308243"/>
                             <a:ext cx="5850890" cy="258445"/>
                           </a:xfrm>
                           <a:prstGeom prst="rect">
@@ -13257,12 +13193,18 @@
                     </wpg:wgp>
                   </a:graphicData>
                 </a:graphic>
+                <wp14:sizeRelH relativeFrom="margin">
+                  <wp14:pctWidth>0</wp14:pctWidth>
+                </wp14:sizeRelH>
+                <wp14:sizeRelV relativeFrom="margin">
+                  <wp14:pctHeight>0</wp14:pctHeight>
+                </wp14:sizeRelV>
               </wp:anchor>
             </w:drawing>
           </mc:Choice>
           <mc:Fallback>
             <w:pict>
-              <v:group w14:anchorId="5B726100" id="Group 3" o:spid="_x0000_s1027" style="position:absolute;left:0;text-align:left;margin-left:-.05pt;margin-top:0;width:467.1pt;height:280.05pt;z-index:251663360" coordsize="59325,35568" o:gfxdata="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">
+              <v:group w14:anchorId="5B726100" id="Group 3" o:spid="_x0000_s1027" style="position:absolute;left:0;text-align:left;margin-left:.05pt;margin-top:.05pt;width:460.7pt;height:280.8pt;z-index:251660288;mso-width-relative:margin;mso-height-relative:margin" coordsize="58515,35666" o:gfxdata="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">
                 <v:shapetype id="_x0000_t75" coordsize="21600,21600" o:spt="75" o:preferrelative="t" path="m@4@5l@4@11@9@11@9@5xe" filled="f" stroked="f">
                   <v:stroke joinstyle="miter"/>
                   <v:formulas>
@@ -13283,9 +13225,9 @@
                   <o:lock v:ext="edit" aspectratio="t"/>
                 </v:shapetype>
                 <v:shape id="Picture 65" o:spid="_x0000_s1028" type="#_x0000_t75" style="position:absolute;width:58515;height:33210;visibility:visible;mso-wrap-style:square" o:gfxdata="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">
-                  <v:imagedata r:id="rId12" o:title=""/>
+                  <v:imagedata r:id="rId11" o:title=""/>
                 </v:shape>
-                <v:shape id="_x0000_s1029" type="#_x0000_t202" style="position:absolute;left:816;top:32983;width:58509;height:2585;visibility:visible;mso-wrap-style:square;v-text-anchor:top" o:gfxdata="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" stroked="f">
+                <v:shape id="_x0000_s1029" type="#_x0000_t202" style="position:absolute;left:6;top:33082;width:58509;height:2584;visibility:visible;mso-wrap-style:square;v-text-anchor:top" o:gfxdata="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" stroked="f">
                   <v:textbox style="mso-fit-shape-to-text:t" inset="0,0,0,0">
                     <w:txbxContent>
                       <w:p>
@@ -13326,6 +13268,66 @@
         </mc:AlternateContent>
       </w:r>
       <w:r>
+        <w:rPr>
+          <w:noProof/>
+        </w:rPr>
+        <w:drawing>
+          <wp:anchor distT="0" distB="0" distL="114300" distR="114300" simplePos="0" relativeHeight="251661312" behindDoc="0" locked="0" layoutInCell="1" allowOverlap="1" wp14:anchorId="0E50653B" wp14:editId="19371C47">
+            <wp:simplePos x="0" y="0"/>
+            <wp:positionH relativeFrom="column">
+              <wp:posOffset>-7793</wp:posOffset>
+            </wp:positionH>
+            <wp:positionV relativeFrom="paragraph">
+              <wp:posOffset>5230611</wp:posOffset>
+            </wp:positionV>
+            <wp:extent cx="5851525" cy="3185160"/>
+            <wp:effectExtent l="0" t="0" r="3175" b="2540"/>
+            <wp:wrapTopAndBottom/>
+            <wp:docPr id="1843029070" name="Picture 4"/>
+            <wp:cNvGraphicFramePr>
+              <a:graphicFrameLocks xmlns:a="http://schemas.openxmlformats.org/drawingml/2006/main" noChangeAspect="1"/>
+            </wp:cNvGraphicFramePr>
+            <a:graphic xmlns:a="http://schemas.openxmlformats.org/drawingml/2006/main">
+              <a:graphicData uri="http://schemas.openxmlformats.org/drawingml/2006/picture">
+                <pic:pic xmlns:pic="http://schemas.openxmlformats.org/drawingml/2006/picture">
+                  <pic:nvPicPr>
+                    <pic:cNvPr id="1843029070" name="Picture 1843029070"/>
+                    <pic:cNvPicPr/>
+                  </pic:nvPicPr>
+                  <pic:blipFill>
+                    <a:blip r:embed="rId12" cstate="print">
+                      <a:extLst>
+                        <a:ext uri="{28A0092B-C50C-407E-A947-70E740481C1C}">
+                          <a14:useLocalDpi xmlns:a14="http://schemas.microsoft.com/office/drawing/2010/main" val="0"/>
+                        </a:ext>
+                      </a:extLst>
+                    </a:blip>
+                    <a:stretch>
+                      <a:fillRect/>
+                    </a:stretch>
+                  </pic:blipFill>
+                  <pic:spPr>
+                    <a:xfrm>
+                      <a:off x="0" y="0"/>
+                      <a:ext cx="5851525" cy="3185160"/>
+                    </a:xfrm>
+                    <a:prstGeom prst="rect">
+                      <a:avLst/>
+                    </a:prstGeom>
+                  </pic:spPr>
+                </pic:pic>
+              </a:graphicData>
+            </a:graphic>
+            <wp14:sizeRelH relativeFrom="page">
+              <wp14:pctWidth>0</wp14:pctWidth>
+            </wp14:sizeRelH>
+            <wp14:sizeRelV relativeFrom="page">
+              <wp14:pctHeight>0</wp14:pctHeight>
+            </wp14:sizeRelV>
+          </wp:anchor>
+        </w:drawing>
+      </w:r>
+      <w:r>
         <w:t xml:space="preserve">V ľavom hornom rohu sa nachádza informačný panel s konečným investičným odporúčaním a jeho odôvodnením. Toto zhrnutie reprezentuje finálne rozhodnutie celého systému. Algoritmus ho negeneruje ako priemer všetkých modelov, ale preberá ho výhradne z takzvaného primárneho modelu </w:t>
       </w:r>
       <w:r>
@@ -13539,14 +13541,12 @@
       <w:r>
         <w:t xml:space="preserve"> &amp; Hold) </w:t>
       </w:r>
-      <w:proofErr w:type="spellStart"/>
       <w:r>
         <w:t>dosiahla</w:t>
       </w:r>
       <w:r>
         <w:t xml:space="preserve"> </w:t>
       </w:r>
-      <w:proofErr w:type="spellEnd"/>
       <w:r>
         <w:t>v rovnakom časovom rámci úspešnosť denného rastu iba v 53,2 % prípadov. Viaceré ďalšie optimalizované algoritmy v simulácii logicky zaostávajú, pričom pre niektoré klesol počet vykonaných obchodov na nulovú úroveň (napríklad ELASTICNET alebo STACK), nakoľko neboli schopné historicky generovať príkazy nad úrovňou počiatočnej matematickej istoty prahu.</w:t>
       </w:r>
@@ -13579,76 +13579,20 @@
         <w:t xml:space="preserve"> znázorňuje odhadované pravdepodobnosti rastu trhovej ceny na nasledujúci obchodný deň, vygenerované klasifikačnými modelmi. Graf na horizontálnej x-osi kvantifikuje pravdepodobnosť, s akou daný model očakáva kladný denný výnos akcie. Hodnota 50 % je </w:t>
       </w:r>
       <w:r>
+        <w:rPr>
+          <w:noProof/>
+        </w:rPr>
         <w:lastRenderedPageBreak/>
-        <w:t xml:space="preserve">znázornená čiernou vertikálnou líniou a predstavuje absolútnu neutrálnu hranicu pohybu. Na grafickú aplikáciu konzervatívnejšieho obchodného pravidla sú tu fixne vyznačené ďalšie hraničné línie pre zóny vyššej štatistickej istoty </w:t>
-      </w:r>
-      <w:r>
-        <w:t>-</w:t>
-      </w:r>
-      <w:r>
-        <w:t xml:space="preserve"> "</w:t>
-      </w:r>
-      <w:proofErr w:type="spellStart"/>
-      <w:r>
-        <w:t>Confident</w:t>
-      </w:r>
-      <w:proofErr w:type="spellEnd"/>
-      <w:r>
-        <w:t xml:space="preserve"> UP" pre pravdepodobnosť nad </w:t>
-      </w:r>
-      <w:r>
-        <w:t>55%</w:t>
-      </w:r>
-      <w:r>
-        <w:t xml:space="preserve"> a "</w:t>
-      </w:r>
-      <w:proofErr w:type="spellStart"/>
-      <w:r>
-        <w:t>Confident</w:t>
-      </w:r>
-      <w:proofErr w:type="spellEnd"/>
-      <w:r>
-        <w:t xml:space="preserve"> DOWN" pre pravdepodobnosť pod </w:t>
-      </w:r>
-      <w:r>
-        <w:t>45%</w:t>
-      </w:r>
-      <w:r>
-        <w:t xml:space="preserve">. Horizontálne stĺpce reprezentujú výstupy jednotlivých </w:t>
-      </w:r>
-      <w:proofErr w:type="spellStart"/>
-      <w:r>
-        <w:t>klasifikátorov</w:t>
-      </w:r>
-      <w:proofErr w:type="spellEnd"/>
-      <w:r>
-        <w:t>. Ich farba sa mení v závislosti od pásma, do ktorého spadá ich nameraná predikcia</w:t>
-      </w:r>
-      <w:r>
-        <w:t xml:space="preserve">: </w:t>
-      </w:r>
-      <w:r>
-        <w:t xml:space="preserve">zelená pre silný signál rastu, červená pre pravdepodobný pokles a oranžová pre oblasť trhovej neistoty. </w:t>
-      </w:r>
-    </w:p>
-    <w:p>
-      <w:pPr>
-        <w:ind w:firstLine="708"/>
-      </w:pPr>
-      <w:r>
-        <w:rPr>
-          <w:noProof/>
-        </w:rPr>
         <mc:AlternateContent>
           <mc:Choice Requires="wpg">
             <w:drawing>
-              <wp:anchor distT="0" distB="0" distL="114300" distR="114300" simplePos="0" relativeHeight="251668480" behindDoc="0" locked="0" layoutInCell="1" allowOverlap="1" wp14:anchorId="01C7AFDC" wp14:editId="64B2407E">
+              <wp:anchor distT="0" distB="0" distL="114300" distR="114300" simplePos="0" relativeHeight="251665408" behindDoc="0" locked="0" layoutInCell="1" allowOverlap="1" wp14:anchorId="01C7AFDC" wp14:editId="4C2D000E">
                 <wp:simplePos x="0" y="0"/>
                 <wp:positionH relativeFrom="column">
                   <wp:posOffset>0</wp:posOffset>
                 </wp:positionH>
                 <wp:positionV relativeFrom="paragraph">
-                  <wp:posOffset>368935</wp:posOffset>
+                  <wp:posOffset>22</wp:posOffset>
                 </wp:positionV>
                 <wp:extent cx="5851525" cy="3774155"/>
                 <wp:effectExtent l="0" t="0" r="3175" b="0"/>
@@ -13700,25 +13644,7 @@
                                 <w:t xml:space="preserve">Obr. </w:t>
                               </w:r>
                               <w:r>
-                                <w:fldChar w:fldCharType="begin"/>
-                              </w:r>
-                              <w:r>
-                                <w:instrText xml:space="preserve"> SEQ Obr. \* ARABIC </w:instrText>
-                              </w:r>
-                              <w:r>
-                                <w:fldChar w:fldCharType="separate"/>
-                              </w:r>
-                              <w:r>
-                                <w:rPr>
-                                  <w:noProof/>
-                                </w:rPr>
                                 <w:t>3</w:t>
-                              </w:r>
-                              <w:r>
-                                <w:rPr>
-                                  <w:noProof/>
-                                </w:rPr>
-                                <w:fldChar w:fldCharType="end"/>
                               </w:r>
                               <w:r>
                                 <w:t xml:space="preserve"> </w:t>
@@ -13779,7 +13705,7 @@
           </mc:Choice>
           <mc:Fallback>
             <w:pict>
-              <v:group w14:anchorId="01C7AFDC" id="Group 5" o:spid="_x0000_s1030" style="position:absolute;left:0;text-align:left;margin-left:0;margin-top:29.05pt;width:460.75pt;height:297.2pt;z-index:251668480" coordsize="58515,37741" o:gfxdata="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">
+              <v:group w14:anchorId="01C7AFDC" id="Group 5" o:spid="_x0000_s1030" style="position:absolute;left:0;text-align:left;margin-left:0;margin-top:0;width:460.75pt;height:297.2pt;z-index:251665408" coordsize="58515,37741" o:gfxdata="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">
                 <v:shape id="_x0000_s1031" type="#_x0000_t202" style="position:absolute;top:35157;width:58515;height:2584;visibility:visible;mso-wrap-style:square;v-text-anchor:top" o:gfxdata="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" stroked="f">
                   <v:textbox style="mso-fit-shape-to-text:t" inset="0,0,0,0">
                     <w:txbxContent>
@@ -13796,25 +13722,7 @@
                           <w:t xml:space="preserve">Obr. </w:t>
                         </w:r>
                         <w:r>
-                          <w:fldChar w:fldCharType="begin"/>
-                        </w:r>
-                        <w:r>
-                          <w:instrText xml:space="preserve"> SEQ Obr. \* ARABIC </w:instrText>
-                        </w:r>
-                        <w:r>
-                          <w:fldChar w:fldCharType="separate"/>
-                        </w:r>
-                        <w:r>
-                          <w:rPr>
-                            <w:noProof/>
-                          </w:rPr>
                           <w:t>3</w:t>
-                        </w:r>
-                        <w:r>
-                          <w:rPr>
-                            <w:noProof/>
-                          </w:rPr>
-                          <w:fldChar w:fldCharType="end"/>
                         </w:r>
                         <w:r>
                           <w:t xml:space="preserve"> </w:t>
@@ -13841,9 +13749,874 @@
           </mc:Fallback>
         </mc:AlternateContent>
       </w:r>
-    </w:p>
-    <w:p/>
-    <w:p/>
+      <w:r>
+        <w:t xml:space="preserve">znázornená čiernou vertikálnou líniou a predstavuje absolútnu neutrálnu hranicu pohybu. Na grafickú aplikáciu konzervatívnejšieho obchodného pravidla sú tu fixne vyznačené ďalšie hraničné línie pre zóny vyššej štatistickej istoty </w:t>
+      </w:r>
+      <w:r>
+        <w:t>-</w:t>
+      </w:r>
+      <w:r>
+        <w:t xml:space="preserve"> "</w:t>
+      </w:r>
+      <w:proofErr w:type="spellStart"/>
+      <w:r>
+        <w:t>Confident</w:t>
+      </w:r>
+      <w:proofErr w:type="spellEnd"/>
+      <w:r>
+        <w:t xml:space="preserve"> UP" pre pravdepodobnosť nad </w:t>
+      </w:r>
+      <w:r>
+        <w:t>55%</w:t>
+      </w:r>
+      <w:r>
+        <w:t xml:space="preserve"> a "</w:t>
+      </w:r>
+      <w:proofErr w:type="spellStart"/>
+      <w:r>
+        <w:t>Confident</w:t>
+      </w:r>
+      <w:proofErr w:type="spellEnd"/>
+      <w:r>
+        <w:t xml:space="preserve"> DOWN" pre pravdepodobnosť pod </w:t>
+      </w:r>
+      <w:r>
+        <w:t>45%</w:t>
+      </w:r>
+      <w:r>
+        <w:t xml:space="preserve">. Horizontálne stĺpce reprezentujú výstupy jednotlivých </w:t>
+      </w:r>
+      <w:proofErr w:type="spellStart"/>
+      <w:r>
+        <w:t>klasifikátorov</w:t>
+      </w:r>
+      <w:proofErr w:type="spellEnd"/>
+      <w:r>
+        <w:t>. Ich farba sa mení v závislosti od pásma, do ktorého spadá ich nameraná predikcia</w:t>
+      </w:r>
+      <w:r>
+        <w:t xml:space="preserve">: </w:t>
+      </w:r>
+      <w:r>
+        <w:t xml:space="preserve">zelená pre silný signál rastu, červená pre pravdepodobný pokles a oranžová pre oblasť trhovej neistoty. </w:t>
+      </w:r>
+      <w:r>
+        <w:t>Tento modul slúži na doplnenie základných regresných odhadov o pravdepodobnostný kontext.</w:t>
+      </w:r>
+    </w:p>
+    <w:p>
+      <w:pPr>
+        <w:ind w:firstLine="708"/>
+      </w:pPr>
+      <w:r>
+        <w:t>Rovnako ako pri regresnej analýze, aj v prípade klasifikácie je pre zhodnotenie schopností algoritmu nutné posúdiť dlhodobú historickú presnosť týchto pravdepodobnostných odhadov. Detailný súbor agregovaných klasifikačných metrík sumarizuje tabuľka na Obrázku č. 4</w:t>
+      </w:r>
+      <w:r>
+        <w:t xml:space="preserve"> ktorá </w:t>
+      </w:r>
+      <w:r>
+        <w:t>poskytuje porovnanie nielen pre štandardnú klasifikačnú úspešnosť Raw DA, ale uvádza aj metriky </w:t>
+      </w:r>
+      <w:proofErr w:type="spellStart"/>
+      <w:r>
+        <w:t>Mean</w:t>
+      </w:r>
+      <w:proofErr w:type="spellEnd"/>
+      <w:r>
+        <w:rPr>
+          <w:b/>
+          <w:bCs/>
+        </w:rPr>
+        <w:t xml:space="preserve"> </w:t>
+      </w:r>
+      <w:proofErr w:type="spellStart"/>
+      <w:r>
+        <w:t>Probability</w:t>
+      </w:r>
+      <w:proofErr w:type="spellEnd"/>
+      <w:r>
+        <w:t> </w:t>
+      </w:r>
+      <w:r>
+        <w:t xml:space="preserve">- </w:t>
+      </w:r>
+      <w:r>
+        <w:t>priemerná historicky vygenerovaná pravdepodobnosť modelu a prenesenú hodnotu istoty </w:t>
+      </w:r>
+      <w:proofErr w:type="spellStart"/>
+      <w:r>
+        <w:t>Confident</w:t>
+      </w:r>
+      <w:proofErr w:type="spellEnd"/>
+      <w:r>
+        <w:t xml:space="preserve"> DA</w:t>
+      </w:r>
+      <w:r>
+        <w:rPr>
+          <w:b/>
+          <w:bCs/>
+        </w:rPr>
+        <w:t xml:space="preserve"> </w:t>
+      </w:r>
+      <w:r>
+        <w:t xml:space="preserve">(&gt; 55 %). Obchodný systém pri </w:t>
+      </w:r>
+      <w:proofErr w:type="spellStart"/>
+      <w:r>
+        <w:t>klasifikátoroch</w:t>
+      </w:r>
+      <w:proofErr w:type="spellEnd"/>
+      <w:r>
+        <w:t xml:space="preserve"> generuje nákupný signál iba vtedy, ak modelová pravdepodobnosť prekoná vopred stanovenú hranicu "veľkej istoty" 0,55. </w:t>
+      </w:r>
+    </w:p>
+    <w:p>
+      <w:pPr>
+        <w:ind w:firstLine="708"/>
+      </w:pPr>
+      <w:r>
+        <w:t xml:space="preserve">Podľa nameraných dát dosiahol výsledky tímový </w:t>
+      </w:r>
+      <w:proofErr w:type="spellStart"/>
+      <w:r>
+        <w:t>meta</w:t>
+      </w:r>
+      <w:proofErr w:type="spellEnd"/>
+      <w:r>
+        <w:t xml:space="preserve">-model STACK so smerovou presnosťou 54,7 % pri 35,5 % trhovom pokrytí (86 zrealizovaných obchodov z 242). Konkurenčný model LOGREG síce teoreticky pokryl až 80,6 % obchodných dní vďaka svojej </w:t>
+      </w:r>
+      <w:r>
+        <w:lastRenderedPageBreak/>
+        <w:t xml:space="preserve">vysokej priemernej hodnote pravdepodobnosti 60,11 %, avšak jeho </w:t>
+      </w:r>
+      <w:proofErr w:type="spellStart"/>
+      <w:r>
+        <w:t>konfidenčná</w:t>
+      </w:r>
+      <w:proofErr w:type="spellEnd"/>
+      <w:r>
+        <w:t xml:space="preserve"> úspešnosť</w:t>
+      </w:r>
+      <w:r>
+        <w:br/>
+      </w:r>
+      <w:r>
+        <w:rPr>
+          <w:noProof/>
+        </w:rPr>
+        <mc:AlternateContent>
+          <mc:Choice Requires="wpg">
+            <w:drawing>
+              <wp:anchor distT="0" distB="0" distL="114300" distR="114300" simplePos="0" relativeHeight="251669504" behindDoc="0" locked="0" layoutInCell="1" allowOverlap="1" wp14:anchorId="7C4D72B1" wp14:editId="7567E656">
+                <wp:simplePos x="0" y="0"/>
+                <wp:positionH relativeFrom="column">
+                  <wp:posOffset>635</wp:posOffset>
+                </wp:positionH>
+                <wp:positionV relativeFrom="paragraph">
+                  <wp:posOffset>534035</wp:posOffset>
+                </wp:positionV>
+                <wp:extent cx="5851525" cy="2076450"/>
+                <wp:effectExtent l="0" t="0" r="3175" b="6350"/>
+                <wp:wrapTopAndBottom/>
+                <wp:docPr id="1822499419" name="Group 7"/>
+                <wp:cNvGraphicFramePr/>
+                <a:graphic xmlns:a="http://schemas.openxmlformats.org/drawingml/2006/main">
+                  <a:graphicData uri="http://schemas.microsoft.com/office/word/2010/wordprocessingGroup">
+                    <wpg:wgp>
+                      <wpg:cNvGrpSpPr/>
+                      <wpg:grpSpPr>
+                        <a:xfrm>
+                          <a:off x="0" y="0"/>
+                          <a:ext cx="5851525" cy="2076450"/>
+                          <a:chOff x="0" y="0"/>
+                          <a:chExt cx="5851525" cy="2076450"/>
+                        </a:xfrm>
+                      </wpg:grpSpPr>
+                      <pic:pic xmlns:pic="http://schemas.openxmlformats.org/drawingml/2006/picture">
+                        <pic:nvPicPr>
+                          <pic:cNvPr id="1135317906" name="Picture 6"/>
+                          <pic:cNvPicPr>
+                            <a:picLocks noChangeAspect="1"/>
+                          </pic:cNvPicPr>
+                        </pic:nvPicPr>
+                        <pic:blipFill>
+                          <a:blip r:embed="rId15" cstate="print">
+                            <a:extLst>
+                              <a:ext uri="{28A0092B-C50C-407E-A947-70E740481C1C}">
+                                <a14:useLocalDpi xmlns:a14="http://schemas.microsoft.com/office/drawing/2010/main" val="0"/>
+                              </a:ext>
+                            </a:extLst>
+                          </a:blip>
+                          <a:stretch>
+                            <a:fillRect/>
+                          </a:stretch>
+                        </pic:blipFill>
+                        <pic:spPr>
+                          <a:xfrm>
+                            <a:off x="0" y="0"/>
+                            <a:ext cx="5851525" cy="1818005"/>
+                          </a:xfrm>
+                          <a:prstGeom prst="rect">
+                            <a:avLst/>
+                          </a:prstGeom>
+                        </pic:spPr>
+                      </pic:pic>
+                      <wps:wsp>
+                        <wps:cNvPr id="641173173" name="Text Box 1"/>
+                        <wps:cNvSpPr txBox="1"/>
+                        <wps:spPr>
+                          <a:xfrm>
+                            <a:off x="0" y="1818005"/>
+                            <a:ext cx="5851525" cy="258445"/>
+                          </a:xfrm>
+                          <a:prstGeom prst="rect">
+                            <a:avLst/>
+                          </a:prstGeom>
+                          <a:solidFill>
+                            <a:prstClr val="white"/>
+                          </a:solidFill>
+                          <a:ln>
+                            <a:noFill/>
+                          </a:ln>
+                        </wps:spPr>
+                        <wps:txbx>
+                          <w:txbxContent>
+                            <w:p>
+                              <w:pPr>
+                                <w:pStyle w:val="Caption"/>
+                                <w:jc w:val="center"/>
+                                <w:rPr>
+                                  <w:noProof/>
+                                  <w:szCs w:val="22"/>
+                                </w:rPr>
+                              </w:pPr>
+                              <w:r>
+                                <w:t xml:space="preserve">Obr.4 </w:t>
+                              </w:r>
+                              <w:r>
+                                <w:t xml:space="preserve">Classification Model </w:t>
+                              </w:r>
+                              <w:proofErr w:type="spellStart"/>
+                              <w:r>
+                                <w:t>Performance</w:t>
+                              </w:r>
+                              <w:proofErr w:type="spellEnd"/>
+                            </w:p>
+                          </w:txbxContent>
+                        </wps:txbx>
+                        <wps:bodyPr rot="0" spcFirstLastPara="0" vertOverflow="overflow" horzOverflow="overflow" vert="horz" wrap="square" lIns="0" tIns="0" rIns="0" bIns="0" numCol="1" spcCol="0" rtlCol="0" fromWordArt="0" anchor="t" anchorCtr="0" forceAA="0" compatLnSpc="1">
+                          <a:prstTxWarp prst="textNoShape">
+                            <a:avLst/>
+                          </a:prstTxWarp>
+                          <a:spAutoFit/>
+                        </wps:bodyPr>
+                      </wps:wsp>
+                    </wpg:wgp>
+                  </a:graphicData>
+                </a:graphic>
+                <wp14:sizeRelV relativeFrom="margin">
+                  <wp14:pctHeight>0</wp14:pctHeight>
+                </wp14:sizeRelV>
+              </wp:anchor>
+            </w:drawing>
+          </mc:Choice>
+          <mc:Fallback>
+            <w:pict>
+              <v:group w14:anchorId="7C4D72B1" id="Group 7" o:spid="_x0000_s1033" style="position:absolute;left:0;text-align:left;margin-left:.05pt;margin-top:42.05pt;width:460.75pt;height:163.5pt;z-index:251669504;mso-height-relative:margin" coordsize="58515,20764" o:gfxdata="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">
+                <v:shape id="Picture 6" o:spid="_x0000_s1034" type="#_x0000_t75" style="position:absolute;width:58515;height:18180;visibility:visible;mso-wrap-style:square" o:gfxdata="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">
+                  <v:imagedata r:id="rId16" o:title=""/>
+                </v:shape>
+                <v:shape id="_x0000_s1035" type="#_x0000_t202" style="position:absolute;top:18180;width:58515;height:2584;visibility:visible;mso-wrap-style:square;v-text-anchor:top" o:gfxdata="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" stroked="f">
+                  <v:textbox style="mso-fit-shape-to-text:t" inset="0,0,0,0">
+                    <w:txbxContent>
+                      <w:p>
+                        <w:pPr>
+                          <w:pStyle w:val="Caption"/>
+                          <w:jc w:val="center"/>
+                          <w:rPr>
+                            <w:noProof/>
+                            <w:szCs w:val="22"/>
+                          </w:rPr>
+                        </w:pPr>
+                        <w:r>
+                          <w:t xml:space="preserve">Obr.4 </w:t>
+                        </w:r>
+                        <w:r>
+                          <w:t xml:space="preserve">Classification Model </w:t>
+                        </w:r>
+                        <w:proofErr w:type="spellStart"/>
+                        <w:r>
+                          <w:t>Performance</w:t>
+                        </w:r>
+                        <w:proofErr w:type="spellEnd"/>
+                      </w:p>
+                    </w:txbxContent>
+                  </v:textbox>
+                </v:shape>
+                <w10:wrap type="topAndBottom"/>
+              </v:group>
+            </w:pict>
+          </mc:Fallback>
+        </mc:AlternateContent>
+      </w:r>
+      <w:r>
+        <w:t>54,4 % mierne zaostala.</w:t>
+      </w:r>
+    </w:p>
+    <w:p>
+      <w:pPr>
+        <w:ind w:firstLine="708"/>
+      </w:pPr>
+      <w:r>
+        <w:t>V porovnaní s referenčnou pasívnou stratégiou (</w:t>
+      </w:r>
+      <w:proofErr w:type="spellStart"/>
+      <w:r>
+        <w:t>Buy</w:t>
+      </w:r>
+      <w:proofErr w:type="spellEnd"/>
+      <w:r>
+        <w:t xml:space="preserve"> &amp; Hold s dlhodobou úspešnosťou 53,2 %) dokázali tieto dva </w:t>
+      </w:r>
+      <w:proofErr w:type="spellStart"/>
+      <w:r>
+        <w:t>klasifikátory</w:t>
+      </w:r>
+      <w:proofErr w:type="spellEnd"/>
+      <w:r>
+        <w:t xml:space="preserve"> mierne navýšiť absolútnu matematickú pravdepodobnosť zisku z každého vykonaného obchodu. Samostatné stromové štruktúry RF a XGB v tomto špecifickom meraní klasifikácie trh neprekonali</w:t>
+      </w:r>
+      <w:r>
+        <w:t xml:space="preserve">, lebo </w:t>
+      </w:r>
+      <w:r>
+        <w:t xml:space="preserve">ich smerová presnosť skončila pod </w:t>
+      </w:r>
+      <w:proofErr w:type="spellStart"/>
+      <w:r>
+        <w:t>urovňou</w:t>
+      </w:r>
+      <w:proofErr w:type="spellEnd"/>
+      <w:r>
+        <w:t xml:space="preserve"> 50 %.</w:t>
+      </w:r>
+    </w:p>
+    <w:p>
+      <w:pPr>
+        <w:pStyle w:val="3Nadpis"/>
+      </w:pPr>
+      <w:r>
+        <w:t>Analýza bodových odchýlok</w:t>
+      </w:r>
+    </w:p>
+    <w:p>
+      <w:pPr>
+        <w:ind w:firstLine="708"/>
+      </w:pPr>
+      <w:r>
+        <w:rPr>
+          <w:noProof/>
+        </w:rPr>
+        <mc:AlternateContent>
+          <mc:Choice Requires="wpg">
+            <w:drawing>
+              <wp:anchor distT="0" distB="0" distL="114300" distR="114300" simplePos="0" relativeHeight="251673600" behindDoc="0" locked="0" layoutInCell="1" allowOverlap="1" wp14:anchorId="535F1722" wp14:editId="5CB8C9E1">
+                <wp:simplePos x="0" y="0"/>
+                <wp:positionH relativeFrom="column">
+                  <wp:posOffset>4445</wp:posOffset>
+                </wp:positionH>
+                <wp:positionV relativeFrom="paragraph">
+                  <wp:posOffset>554990</wp:posOffset>
+                </wp:positionV>
+                <wp:extent cx="5851525" cy="3743960"/>
+                <wp:effectExtent l="0" t="0" r="3175" b="2540"/>
+                <wp:wrapTopAndBottom/>
+                <wp:docPr id="395069280" name="Group 8"/>
+                <wp:cNvGraphicFramePr/>
+                <a:graphic xmlns:a="http://schemas.openxmlformats.org/drawingml/2006/main">
+                  <a:graphicData uri="http://schemas.microsoft.com/office/word/2010/wordprocessingGroup">
+                    <wpg:wgp>
+                      <wpg:cNvGrpSpPr/>
+                      <wpg:grpSpPr>
+                        <a:xfrm>
+                          <a:off x="0" y="0"/>
+                          <a:ext cx="5851525" cy="3743960"/>
+                          <a:chOff x="0" y="0"/>
+                          <a:chExt cx="5851525" cy="3743960"/>
+                        </a:xfrm>
+                      </wpg:grpSpPr>
+                      <pic:pic xmlns:pic="http://schemas.openxmlformats.org/drawingml/2006/picture">
+                        <pic:nvPicPr>
+                          <pic:cNvPr id="277766660" name="Picture 1"/>
+                          <pic:cNvPicPr>
+                            <a:picLocks noChangeAspect="1"/>
+                          </pic:cNvPicPr>
+                        </pic:nvPicPr>
+                        <pic:blipFill>
+                          <a:blip r:embed="rId17" cstate="print">
+                            <a:extLst>
+                              <a:ext uri="{28A0092B-C50C-407E-A947-70E740481C1C}">
+                                <a14:useLocalDpi xmlns:a14="http://schemas.microsoft.com/office/drawing/2010/main" val="0"/>
+                              </a:ext>
+                            </a:extLst>
+                          </a:blip>
+                          <a:srcRect/>
+                          <a:stretch/>
+                        </pic:blipFill>
+                        <pic:spPr>
+                          <a:xfrm>
+                            <a:off x="138" y="0"/>
+                            <a:ext cx="5851249" cy="3485515"/>
+                          </a:xfrm>
+                          <a:prstGeom prst="rect">
+                            <a:avLst/>
+                          </a:prstGeom>
+                        </pic:spPr>
+                      </pic:pic>
+                      <wps:wsp>
+                        <wps:cNvPr id="1396181775" name="Text Box 1"/>
+                        <wps:cNvSpPr txBox="1"/>
+                        <wps:spPr>
+                          <a:xfrm>
+                            <a:off x="0" y="3485515"/>
+                            <a:ext cx="5851525" cy="258445"/>
+                          </a:xfrm>
+                          <a:prstGeom prst="rect">
+                            <a:avLst/>
+                          </a:prstGeom>
+                          <a:solidFill>
+                            <a:prstClr val="white"/>
+                          </a:solidFill>
+                          <a:ln>
+                            <a:noFill/>
+                          </a:ln>
+                        </wps:spPr>
+                        <wps:txbx>
+                          <w:txbxContent>
+                            <w:p>
+                              <w:pPr>
+                                <w:pStyle w:val="Caption"/>
+                                <w:jc w:val="center"/>
+                                <w:rPr>
+                                  <w:szCs w:val="22"/>
+                                </w:rPr>
+                              </w:pPr>
+                              <w:r>
+                                <w:t xml:space="preserve">Obr. 5 </w:t>
+                              </w:r>
+                              <w:r>
+                                <w:t xml:space="preserve">Predikované </w:t>
+                              </w:r>
+                              <w:proofErr w:type="spellStart"/>
+                              <w:r>
+                                <w:t>vs</w:t>
+                              </w:r>
+                              <w:proofErr w:type="spellEnd"/>
+                              <w:r>
+                                <w:t>. Skutočné výnosy</w:t>
+                              </w:r>
+                            </w:p>
+                          </w:txbxContent>
+                        </wps:txbx>
+                        <wps:bodyPr rot="0" spcFirstLastPara="0" vertOverflow="overflow" horzOverflow="overflow" vert="horz" wrap="square" lIns="0" tIns="0" rIns="0" bIns="0" numCol="1" spcCol="0" rtlCol="0" fromWordArt="0" anchor="t" anchorCtr="0" forceAA="0" compatLnSpc="1">
+                          <a:prstTxWarp prst="textNoShape">
+                            <a:avLst/>
+                          </a:prstTxWarp>
+                          <a:spAutoFit/>
+                        </wps:bodyPr>
+                      </wps:wsp>
+                    </wpg:wgp>
+                  </a:graphicData>
+                </a:graphic>
+                <wp14:sizeRelV relativeFrom="margin">
+                  <wp14:pctHeight>0</wp14:pctHeight>
+                </wp14:sizeRelV>
+              </wp:anchor>
+            </w:drawing>
+          </mc:Choice>
+          <mc:Fallback>
+            <w:pict>
+              <v:group w14:anchorId="535F1722" id="Group 8" o:spid="_x0000_s1036" style="position:absolute;left:0;text-align:left;margin-left:.35pt;margin-top:43.7pt;width:460.75pt;height:294.8pt;z-index:251673600;mso-height-relative:margin" coordsize="58515,37439" o:gfxdata="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">
+                <v:shape id="Picture 1" o:spid="_x0000_s1037" type="#_x0000_t75" style="position:absolute;left:1;width:58512;height:34855;visibility:visible;mso-wrap-style:square" o:gfxdata="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">
+                  <v:imagedata r:id="rId18" o:title=""/>
+                </v:shape>
+                <v:shape id="_x0000_s1038" type="#_x0000_t202" style="position:absolute;top:34855;width:58515;height:2584;visibility:visible;mso-wrap-style:square;v-text-anchor:top" o:gfxdata="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" stroked="f">
+                  <v:textbox style="mso-fit-shape-to-text:t" inset="0,0,0,0">
+                    <w:txbxContent>
+                      <w:p>
+                        <w:pPr>
+                          <w:pStyle w:val="Caption"/>
+                          <w:jc w:val="center"/>
+                          <w:rPr>
+                            <w:szCs w:val="22"/>
+                          </w:rPr>
+                        </w:pPr>
+                        <w:r>
+                          <w:t xml:space="preserve">Obr. 5 </w:t>
+                        </w:r>
+                        <w:r>
+                          <w:t xml:space="preserve">Predikované </w:t>
+                        </w:r>
+                        <w:proofErr w:type="spellStart"/>
+                        <w:r>
+                          <w:t>vs</w:t>
+                        </w:r>
+                        <w:proofErr w:type="spellEnd"/>
+                        <w:r>
+                          <w:t>. Skutočné výnosy</w:t>
+                        </w:r>
+                      </w:p>
+                    </w:txbxContent>
+                  </v:textbox>
+                </v:shape>
+                <w10:wrap type="topAndBottom"/>
+              </v:group>
+            </w:pict>
+          </mc:Fallback>
+        </mc:AlternateContent>
+      </w:r>
+      <w:r>
+        <w:t>Obrázok č.</w:t>
+      </w:r>
+      <w:r>
+        <w:t xml:space="preserve"> 5</w:t>
+      </w:r>
+      <w:r>
+        <w:t xml:space="preserve"> znázorňuje bodový </w:t>
+      </w:r>
+      <w:proofErr w:type="spellStart"/>
+      <w:r>
+        <w:t>zhlukový</w:t>
+      </w:r>
+      <w:proofErr w:type="spellEnd"/>
+      <w:r>
+        <w:t xml:space="preserve"> graf, ktorý vizualizuje a sumarizuje priamy vzťah medzi predikovanými dennými logaritmickými výnosmi (zobrazenými na vertikálnej y-</w:t>
+      </w:r>
+      <w:r>
+        <w:lastRenderedPageBreak/>
+        <w:t>osi) a skutočnými realizovanými trhovými výnosmi akcie Apple (na horizontálnej x-osi) počas testovacieho obdobia.</w:t>
+      </w:r>
+    </w:p>
+    <w:p>
+      <w:pPr>
+        <w:ind w:firstLine="708"/>
+      </w:pPr>
+      <w:r>
+        <w:t>Každý jeden zobrazený bod v grafe reprezentuje uzatvorený denný odhad konkrétneho modelu pre jeden reálny obchodný deň. Uplatnené regresné algoritmy sú pre lepšiu prehľadnosť navzájom farebne odlíšené. Tento grafický nástroj neslúži ani tak na meranie konečného zisku, ako skôr na vizuálnu diagnostiku chybovosti jednotlivých modelov.</w:t>
+      </w:r>
+    </w:p>
+    <w:p>
+      <w:pPr>
+        <w:ind w:firstLine="708"/>
+      </w:pPr>
+      <w:r>
+        <w:t>Centrálnym analytickým a referenčným prvkom tohto grafu je prerušovaná diagonálna línia perfektnej predikcie. Ak by model dokázal v daný deň so stopercentnou presnosťou odhadnúť silu trhového pohybu, jeho nameraný bod by ležal presne na tejto priamke. V trhovej praxi však body nachádzajúce sa pod touto čiarou indikujú dni, kedy algoritmus reálny výnos matematicky podhodnotil, kým body nad touto čiarou znamenajú jeho faktické nadhodnotenie.</w:t>
+      </w:r>
+    </w:p>
+    <w:p>
+      <w:pPr>
+        <w:keepNext/>
+        <w:ind w:firstLine="357"/>
+      </w:pPr>
+      <w:r>
+        <w:t xml:space="preserve">Z grafu je zrejmé, že predikcie modelov (na y-osi) sú oveľa menej rozptýlené ako skutočné denné výnosy trhu (na x-osi). Väčšina bodových predikcií sa nachádza v úzkom vodorovnom páse blízko nuly, zatiaľ čo skutočné trhové výnosy vykazujú omnoho širšie rozpätie hodnôt, vrátane nepredvídateľných denných skokov. Znamená to, že algoritmy fungujú z historického hľadiska skôr konzervatívne </w:t>
+      </w:r>
+      <w:r>
+        <w:t>-</w:t>
+      </w:r>
+      <w:r>
+        <w:t xml:space="preserve"> vo väčšine sledovaných dní predpovedajú iba relatívne malé, bežné trhové zmeny a systémovo sa nesnažia nerealisticky zachytávať extrémne cenové anomálie.</w:t>
+      </w:r>
+    </w:p>
+    <w:p>
+      <w:pPr>
+        <w:pStyle w:val="3Nadpis"/>
+      </w:pPr>
+      <w:r>
+        <w:t>Distribúcia chýb predikcií</w:t>
+      </w:r>
+    </w:p>
+    <w:p>
+      <w:pPr>
+        <w:ind w:firstLine="708"/>
+      </w:pPr>
+      <w:r>
+        <w:rPr>
+          <w:highlight w:val="yellow"/>
+        </w:rPr>
+        <w:t xml:space="preserve">Obrázok č. </w:t>
+      </w:r>
+      <w:r>
+        <w:rPr>
+          <w:highlight w:val="yellow"/>
+        </w:rPr>
+        <w:t>6</w:t>
+      </w:r>
+      <w:r>
+        <w:rPr>
+          <w:highlight w:val="yellow"/>
+        </w:rPr>
+        <w:t xml:space="preserve"> znázorňuje </w:t>
+      </w:r>
+      <w:proofErr w:type="spellStart"/>
+      <w:r>
+        <w:rPr>
+          <w:highlight w:val="yellow"/>
+        </w:rPr>
+        <w:t>histogram</w:t>
+      </w:r>
+      <w:proofErr w:type="spellEnd"/>
+      <w:r>
+        <w:rPr>
+          <w:highlight w:val="yellow"/>
+        </w:rPr>
+        <w:t xml:space="preserve"> hustoty</w:t>
+      </w:r>
+      <w:r>
+        <w:t xml:space="preserve"> rozdelenia predikčných pre všetky analyzované regresné modely. Táto trhová chyba je vo výpočtoch definovaná ako rozdiel medzi odhadovaným výnosom z výstupu modelu a skutočne realizovaným denným výnosom akcie.</w:t>
+      </w:r>
+    </w:p>
+    <w:p>
+      <w:pPr>
+        <w:ind w:firstLine="708"/>
+      </w:pPr>
+      <w:r>
+        <w:t xml:space="preserve">Horizontálna os </w:t>
+      </w:r>
+      <w:proofErr w:type="spellStart"/>
+      <w:r>
+        <w:t>histogramu</w:t>
+      </w:r>
+      <w:proofErr w:type="spellEnd"/>
+      <w:r>
+        <w:t xml:space="preserve"> kvantifikuje priamu veľkosť spomínanej odchýlky, zatiaľ čo vertikálna os (</w:t>
+      </w:r>
+      <w:proofErr w:type="spellStart"/>
+      <w:r>
+        <w:t>Density</w:t>
+      </w:r>
+      <w:proofErr w:type="spellEnd"/>
+      <w:r>
+        <w:t>) meria relatívnu frekvenciu výskytu konkrétnej chyby počas testovacieho periódu. Čierna vertikálna línia na stredovej hodnote nula (x = 0) logicky reprezentuje scenár dokonalej trhovej predikcie s nulovou odchýlkou.</w:t>
+      </w:r>
+    </w:p>
+    <w:p>
+      <w:pPr>
+        <w:ind w:firstLine="357"/>
+      </w:pPr>
+      <w:r>
+        <w:t xml:space="preserve">Z celkového tvaru zloženej distribúcie vyplýva, že chyby testovaných algoritmov sa formujú plne symetricky a ich výskyt sa koncentruje bezprostredne v okolí stredovej nulovej hodnoty. Skutočnosť, že ľavá aj pravá strana grafu klesajú relatívne rovnomerne naprieč modelmi, potvrdzuje kľúčový štatistický predpoklad: naše natrénované algoritmy netrpia takzvaným systematickým vychýlením. Modely teda budúce trhové výnosy ani permanentne </w:t>
+      </w:r>
+      <w:r>
+        <w:lastRenderedPageBreak/>
+        <w:t xml:space="preserve">nepodhodnocujú, ani pravidelne nenadhodnocujú. Ich analytické nepresnosti iba prirodzene </w:t>
+      </w:r>
+      <w:r>
+        <w:rPr>
+          <w:noProof/>
+        </w:rPr>
+        <mc:AlternateContent>
+          <mc:Choice Requires="wpg">
+            <w:drawing>
+              <wp:anchor distT="0" distB="0" distL="114300" distR="114300" simplePos="0" relativeHeight="251677696" behindDoc="0" locked="0" layoutInCell="1" allowOverlap="1" wp14:anchorId="2F0E51E3" wp14:editId="7D994F8D">
+                <wp:simplePos x="0" y="0"/>
+                <wp:positionH relativeFrom="column">
+                  <wp:posOffset>-35309</wp:posOffset>
+                </wp:positionH>
+                <wp:positionV relativeFrom="paragraph">
+                  <wp:posOffset>535723</wp:posOffset>
+                </wp:positionV>
+                <wp:extent cx="5851525" cy="3742690"/>
+                <wp:effectExtent l="0" t="0" r="3175" b="3810"/>
+                <wp:wrapTopAndBottom/>
+                <wp:docPr id="1245640769" name="Group 9"/>
+                <wp:cNvGraphicFramePr/>
+                <a:graphic xmlns:a="http://schemas.openxmlformats.org/drawingml/2006/main">
+                  <a:graphicData uri="http://schemas.microsoft.com/office/word/2010/wordprocessingGroup">
+                    <wpg:wgp>
+                      <wpg:cNvGrpSpPr/>
+                      <wpg:grpSpPr>
+                        <a:xfrm>
+                          <a:off x="0" y="0"/>
+                          <a:ext cx="5851525" cy="3742690"/>
+                          <a:chOff x="0" y="0"/>
+                          <a:chExt cx="5851525" cy="3743050"/>
+                        </a:xfrm>
+                      </wpg:grpSpPr>
+                      <pic:pic xmlns:pic="http://schemas.openxmlformats.org/drawingml/2006/picture">
+                        <pic:nvPicPr>
+                          <pic:cNvPr id="555602938" name="Picture 1"/>
+                          <pic:cNvPicPr>
+                            <a:picLocks noChangeAspect="1"/>
+                          </pic:cNvPicPr>
+                        </pic:nvPicPr>
+                        <pic:blipFill>
+                          <a:blip r:embed="rId19" cstate="print">
+                            <a:extLst>
+                              <a:ext uri="{28A0092B-C50C-407E-A947-70E740481C1C}">
+                                <a14:useLocalDpi xmlns:a14="http://schemas.microsoft.com/office/drawing/2010/main" val="0"/>
+                              </a:ext>
+                            </a:extLst>
+                          </a:blip>
+                          <a:srcRect/>
+                          <a:stretch/>
+                        </pic:blipFill>
+                        <pic:spPr>
+                          <a:xfrm>
+                            <a:off x="419" y="0"/>
+                            <a:ext cx="5850686" cy="3485515"/>
+                          </a:xfrm>
+                          <a:prstGeom prst="rect">
+                            <a:avLst/>
+                          </a:prstGeom>
+                        </pic:spPr>
+                      </pic:pic>
+                      <wps:wsp>
+                        <wps:cNvPr id="1960056218" name="Text Box 1"/>
+                        <wps:cNvSpPr txBox="1"/>
+                        <wps:spPr>
+                          <a:xfrm>
+                            <a:off x="0" y="3484605"/>
+                            <a:ext cx="5851525" cy="258445"/>
+                          </a:xfrm>
+                          <a:prstGeom prst="rect">
+                            <a:avLst/>
+                          </a:prstGeom>
+                          <a:solidFill>
+                            <a:prstClr val="white"/>
+                          </a:solidFill>
+                          <a:ln>
+                            <a:noFill/>
+                          </a:ln>
+                        </wps:spPr>
+                        <wps:txbx>
+                          <w:txbxContent>
+                            <w:p>
+                              <w:pPr>
+                                <w:pStyle w:val="Caption"/>
+                                <w:jc w:val="center"/>
+                                <w:rPr>
+                                  <w:szCs w:val="22"/>
+                                </w:rPr>
+                              </w:pPr>
+                              <w:r>
+                                <w:t xml:space="preserve">Obr. </w:t>
+                              </w:r>
+                              <w:r>
+                                <w:t xml:space="preserve">6 </w:t>
+                              </w:r>
+                              <w:proofErr w:type="spellStart"/>
+                              <w:r>
+                                <w:t>Prediction</w:t>
+                              </w:r>
+                              <w:proofErr w:type="spellEnd"/>
+                              <w:r>
+                                <w:t xml:space="preserve"> </w:t>
+                              </w:r>
+                              <w:proofErr w:type="spellStart"/>
+                              <w:r>
+                                <w:t>Error</w:t>
+                              </w:r>
+                              <w:proofErr w:type="spellEnd"/>
+                              <w:r>
+                                <w:t xml:space="preserve"> </w:t>
+                              </w:r>
+                              <w:proofErr w:type="spellStart"/>
+                              <w:r>
+                                <w:t>Distribution</w:t>
+                              </w:r>
+                              <w:proofErr w:type="spellEnd"/>
+                            </w:p>
+                          </w:txbxContent>
+                        </wps:txbx>
+                        <wps:bodyPr rot="0" spcFirstLastPara="0" vertOverflow="overflow" horzOverflow="overflow" vert="horz" wrap="square" lIns="0" tIns="0" rIns="0" bIns="0" numCol="1" spcCol="0" rtlCol="0" fromWordArt="0" anchor="t" anchorCtr="0" forceAA="0" compatLnSpc="1">
+                          <a:prstTxWarp prst="textNoShape">
+                            <a:avLst/>
+                          </a:prstTxWarp>
+                          <a:spAutoFit/>
+                        </wps:bodyPr>
+                      </wps:wsp>
+                    </wpg:wgp>
+                  </a:graphicData>
+                </a:graphic>
+              </wp:anchor>
+            </w:drawing>
+          </mc:Choice>
+          <mc:Fallback>
+            <w:pict>
+              <v:group w14:anchorId="2F0E51E3" id="Group 9" o:spid="_x0000_s1039" style="position:absolute;left:0;text-align:left;margin-left:-2.8pt;margin-top:42.2pt;width:460.75pt;height:294.7pt;z-index:251677696" coordsize="58515,37430" o:gfxdata="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">
+                <v:shape id="Picture 1" o:spid="_x0000_s1040" type="#_x0000_t75" style="position:absolute;left:4;width:58507;height:34855;visibility:visible;mso-wrap-style:square" o:gfxdata="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">
+                  <v:imagedata r:id="rId20" o:title=""/>
+                </v:shape>
+                <v:shape id="_x0000_s1041" type="#_x0000_t202" style="position:absolute;top:34846;width:58515;height:2584;visibility:visible;mso-wrap-style:square;v-text-anchor:top" o:gfxdata="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" stroked="f">
+                  <v:textbox style="mso-fit-shape-to-text:t" inset="0,0,0,0">
+                    <w:txbxContent>
+                      <w:p>
+                        <w:pPr>
+                          <w:pStyle w:val="Caption"/>
+                          <w:jc w:val="center"/>
+                          <w:rPr>
+                            <w:szCs w:val="22"/>
+                          </w:rPr>
+                        </w:pPr>
+                        <w:r>
+                          <w:t xml:space="preserve">Obr. </w:t>
+                        </w:r>
+                        <w:r>
+                          <w:t xml:space="preserve">6 </w:t>
+                        </w:r>
+                        <w:proofErr w:type="spellStart"/>
+                        <w:r>
+                          <w:t>Prediction</w:t>
+                        </w:r>
+                        <w:proofErr w:type="spellEnd"/>
+                        <w:r>
+                          <w:t xml:space="preserve"> </w:t>
+                        </w:r>
+                        <w:proofErr w:type="spellStart"/>
+                        <w:r>
+                          <w:t>Error</w:t>
+                        </w:r>
+                        <w:proofErr w:type="spellEnd"/>
+                        <w:r>
+                          <w:t xml:space="preserve"> </w:t>
+                        </w:r>
+                        <w:proofErr w:type="spellStart"/>
+                        <w:r>
+                          <w:t>Distribution</w:t>
+                        </w:r>
+                        <w:proofErr w:type="spellEnd"/>
+                      </w:p>
+                    </w:txbxContent>
+                  </v:textbox>
+                </v:shape>
+                <w10:wrap type="topAndBottom"/>
+              </v:group>
+            </w:pict>
+          </mc:Fallback>
+        </mc:AlternateContent>
+      </w:r>
+      <w:r>
+        <w:t>kopírujú každodennú trhovú volatilitu z oboch strán s neutrálnym rozptylom chýb.</w:t>
+      </w:r>
+    </w:p>
+    <w:p>
+      <w:pPr>
+        <w:ind w:firstLine="708"/>
+        <w:jc w:val="right"/>
+        <w:rPr>
+          <w:lang w:val="en-US"/>
+        </w:rPr>
+      </w:pPr>
+    </w:p>
+    <w:p>
+      <w:pPr>
+        <w:ind w:firstLine="708"/>
+        <w:rPr>
+          <w:lang w:val="en-US"/>
+        </w:rPr>
+      </w:pPr>
+    </w:p>
     <w:p>
       <w:pPr>
         <w:pStyle w:val="2Nadpis"/>

</xml_diff>